<commit_message>
Hedge the SEPlains sketch and stop printing Alaska AUC as nan.
Keep C5 post-hoc and non-causal in the conclusions, and render undefined fold AUCs as undefined in the built SI table.

Co-authored-by: Cursor <cursoragent@cursor.com>
</commit_message>
<xml_diff>
--- a/paper/submission/agu_main_manuscript.docx
+++ b/paper/submission/agu_main_manuscript.docx
@@ -109,7 +109,7 @@
         </w:numPr>
       </w:pPr>
       <w:r>
-        <w:t xml:space="preserve">No national skill (frozen AUC 0.407; post-hoc mean 0.526); direction is region-dependent and reverses in the Southeast Plains.</w:t>
+        <w:t xml:space="preserve">No national skill (frozen AUC 0.407; post-hoc mean 0.526); post-hoc direction is region-dependent and reverses in the Southeast Plains.</w:t>
       </w:r>
     </w:p>
     <w:bookmarkEnd w:id="10"/>
@@ -1245,7 +1245,7 @@
         </m:r>
       </m:oMath>
       <w:r>
-        <w:t xml:space="preserve">. To test state dependence, we recalculated the heuristic for 2016–2017 (a leakage-free but short bridge) and for 2016–2020 (a post-hoc state-matched diagnostic that overlaps evaluation and is not predictive evidence).</w:t>
+        <w:t xml:space="preserve">. To test state dependence, we recalculated the heuristic for 2016–2017 (a leakage-free but short post-hoc bridge; those years remain the frozen model-selection split) and for 2016–2020 (a post-hoc state-matched diagnostic that overlaps evaluation and is not predictive evidence).</w:t>
       </w:r>
     </w:p>
     <w:bookmarkEnd w:id="16"/>
@@ -2226,7 +2226,55 @@
               <w:pStyle w:val="Compact"/>
             </w:pPr>
             <w:r>
-              <w:t xml:space="preserve">2016–2017 and 2016–2020 state-matched heuristic and climatology</w:t>
+              <w:t xml:space="preserve">2016–2017 as the model-selection / validation split</w:t>
+            </w:r>
+          </w:p>
+        </w:tc>
+        <w:tc>
+          <w:tcPr/>
+          <w:p>
+            <w:pPr>
+              <w:pStyle w:val="Compact"/>
+            </w:pPr>
+            <w:r>
+              <w:t xml:space="preserve">Frozen</w:t>
+            </w:r>
+          </w:p>
+        </w:tc>
+      </w:tr>
+      <w:tr>
+        <w:tc>
+          <w:tcPr/>
+          <w:p>
+            <w:pPr>
+              <w:pStyle w:val="Compact"/>
+            </w:pPr>
+            <w:r>
+              <w:t xml:space="preserve">2016–2017 heuristic recalculation</w:t>
+            </w:r>
+          </w:p>
+        </w:tc>
+        <w:tc>
+          <w:tcPr/>
+          <w:p>
+            <w:pPr>
+              <w:pStyle w:val="Compact"/>
+            </w:pPr>
+            <w:r>
+              <w:t xml:space="preserve">Post-hoc; leakage-free bridge</w:t>
+            </w:r>
+          </w:p>
+        </w:tc>
+      </w:tr>
+      <w:tr>
+        <w:tc>
+          <w:tcPr/>
+          <w:p>
+            <w:pPr>
+              <w:pStyle w:val="Compact"/>
+            </w:pPr>
+            <w:r>
+              <w:t xml:space="preserve">2016–2020 state-matched heuristic and climatology</w:t>
             </w:r>
           </w:p>
         </w:tc>
@@ -2836,7 +2884,7 @@
         </m:r>
       </m:oMath>
       <w:r>
-        <w:t xml:space="preserve">; base rate 0.508). That reversal is consistent with a mechanism sketch in which natural low-amplitude, long-memory regimes–groundwater influence, sluggish flow, and a warm climate–can reproduce the regulated signature; it is not a causal attribution. This geography is why within-climate comparisons such as Jinsha and Chattahoochee can hold while a national classifier fails. The post-hoc mean of 0.526 is still no national skill and does not replace the frozen primary.</w:t>
+        <w:t xml:space="preserve">; base rate 0.508). That reversal is consistent with a mechanism sketch in which natural low-amplitude, long-memory regimes–groundwater influence, sluggish flow, and a warm climate–can reproduce the regulated signature; it is not a causal attribution. The same geography is consistent with within-climate comparisons such as Jinsha and Chattahoochee holding while a national classifier fails. The post-hoc mean of 0.526 is still no national skill and does not replace the frozen primary.</w:t>
       </w:r>
     </w:p>
     <w:p>
@@ -3092,7 +3140,7 @@
         <w:pStyle w:val="FirstParagraph"/>
       </w:pPr>
       <w:r>
-        <w:t xml:space="preserve">Reservoir-associated thermal structure contains information about stream-temperature recoverability. In both detailed networks, the dam-proximal station is uniquely memory-dominated from 14- to 90-day horizons, and a fixed validation-selected model performs substantially worse there on long held-out gaps. National discrimination is not supported (frozen pooled leave-one-ecoregion-out AUC 0.407; post-hoc mean within-fold AUC 0.526). A post-hoc diagnosis finds that the fingerprint’s direction is region-dependent, ranging from AUC 0.755 in the Northeast to 0.132 in the Southeast Plains, where natural low-amplitude long-memory regimes can reproduce the regulated signature. That geography is why within-climate case studies can hold while a national classifier fails. The covariance heuristic can therefore screen local monitoring structure before model fitting, provided state, geography, and absolute error are calibrated and no causal threshold is inferred from the index alone.</w:t>
+        <w:t xml:space="preserve">Reservoir-associated thermal structure contains information about stream-temperature recoverability. In both detailed networks, the dam-proximal station is uniquely memory-dominated from 14- to 90-day horizons, and a fixed validation-selected model performs substantially worse there on long held-out gaps. National discrimination is not supported (frozen pooled leave-one-ecoregion-out AUC 0.407; post-hoc mean within-fold AUC 0.526). A post-hoc diagnosis finds that the fingerprint’s direction is region-dependent, ranging from AUC 0.755 in the Northeast to 0.132 in the Southeast Plains. That reversal is consistent with a mechanism sketch in which natural low-amplitude, long-memory regimes can reproduce the regulated signature; it is not a causal attribution. The same geography is consistent with within-climate case studies holding while a national classifier fails. The covariance heuristic can therefore screen local monitoring structure before model fitting, provided state, geography, and absolute error are calibrated and no causal threshold is inferred from the index alone.</w:t>
       </w:r>
     </w:p>
     <w:bookmarkEnd w:id="36"/>
@@ -3602,7 +3650,7 @@
           <w:p>
             <w:pPr>
               <w:pStyle w:val="Compact"/>
-              <w:jc w:val="right"/>
+              <w:jc w:val="left"/>
             </w:pPr>
             <w:r>
               <w:t xml:space="preserve">dam_distance_km</w:t>
@@ -3856,10 +3904,10 @@
           <w:p>
             <w:pPr>
               <w:pStyle w:val="Compact"/>
-              <w:jc w:val="right"/>
-            </w:pPr>
-            <w:r>
-              <w:t xml:space="preserve">nan</w:t>
+              <w:jc w:val="left"/>
+            </w:pPr>
+            <w:r>
+              <w:t xml:space="preserve">undefined</w:t>
             </w:r>
           </w:p>
         </w:tc>
@@ -4110,10 +4158,10 @@
           <w:p>
             <w:pPr>
               <w:pStyle w:val="Compact"/>
-              <w:jc w:val="right"/>
-            </w:pPr>
-            <w:r>
-              <w:t xml:space="preserve">nan</w:t>
+              <w:jc w:val="left"/>
+            </w:pPr>
+            <w:r>
+              <w:t xml:space="preserve">undefined</w:t>
             </w:r>
           </w:p>
         </w:tc>
@@ -4364,10 +4412,10 @@
           <w:p>
             <w:pPr>
               <w:pStyle w:val="Compact"/>
-              <w:jc w:val="right"/>
-            </w:pPr>
-            <w:r>
-              <w:t xml:space="preserve">27</w:t>
+              <w:jc w:val="left"/>
+            </w:pPr>
+            <w:r>
+              <w:t xml:space="preserve">27.0</w:t>
             </w:r>
           </w:p>
         </w:tc>
@@ -4618,7 +4666,7 @@
           <w:p>
             <w:pPr>
               <w:pStyle w:val="Compact"/>
-              <w:jc w:val="right"/>
+              <w:jc w:val="left"/>
             </w:pPr>
             <w:r>
               <w:t xml:space="preserve">0.366</w:t>
@@ -4872,7 +4920,7 @@
           <w:p>
             <w:pPr>
               <w:pStyle w:val="Compact"/>
-              <w:jc w:val="right"/>
+              <w:jc w:val="left"/>
             </w:pPr>
             <w:r>
               <w:t xml:space="preserve">21.432</w:t>
@@ -5126,7 +5174,7 @@
           <w:p>
             <w:pPr>
               <w:pStyle w:val="Compact"/>
-              <w:jc w:val="right"/>
+              <w:jc w:val="left"/>
             </w:pPr>
             <w:r>
               <w:t xml:space="preserve">29.325</w:t>
@@ -5380,7 +5428,7 @@
           <w:p>
             <w:pPr>
               <w:pStyle w:val="Compact"/>
-              <w:jc w:val="right"/>
+              <w:jc w:val="left"/>
             </w:pPr>
             <w:r>
               <w:t xml:space="preserve">48.279</w:t>
@@ -5634,7 +5682,7 @@
           <w:p>
             <w:pPr>
               <w:pStyle w:val="Compact"/>
-              <w:jc w:val="right"/>
+              <w:jc w:val="left"/>
             </w:pPr>
             <w:r>
               <w:t xml:space="preserve">78.521</w:t>
@@ -10716,7 +10764,7 @@
           <w:p>
             <w:pPr>
               <w:pStyle w:val="Compact"/>
-              <w:jc w:val="right"/>
+              <w:jc w:val="left"/>
             </w:pPr>
             <w:r>
               <w:t xml:space="preserve">statistical_frontier_days</w:t>
@@ -10874,10 +10922,10 @@
           <w:p>
             <w:pPr>
               <w:pStyle w:val="Compact"/>
-              <w:jc w:val="right"/>
-            </w:pPr>
-            <w:r>
-              <w:t xml:space="preserve">365</w:t>
+              <w:jc w:val="left"/>
+            </w:pPr>
+            <w:r>
+              <w:t xml:space="preserve">365.0</w:t>
             </w:r>
           </w:p>
         </w:tc>
@@ -11032,10 +11080,10 @@
           <w:p>
             <w:pPr>
               <w:pStyle w:val="Compact"/>
-              <w:jc w:val="right"/>
-            </w:pPr>
-            <w:r>
-              <w:t xml:space="preserve">365</w:t>
+              <w:jc w:val="left"/>
+            </w:pPr>
+            <w:r>
+              <w:t xml:space="preserve">365.0</w:t>
             </w:r>
           </w:p>
         </w:tc>
@@ -11190,10 +11238,10 @@
           <w:p>
             <w:pPr>
               <w:pStyle w:val="Compact"/>
-              <w:jc w:val="right"/>
-            </w:pPr>
-            <w:r>
-              <w:t xml:space="preserve">365</w:t>
+              <w:jc w:val="left"/>
+            </w:pPr>
+            <w:r>
+              <w:t xml:space="preserve">365.0</w:t>
             </w:r>
           </w:p>
         </w:tc>
@@ -11348,7 +11396,7 @@
           <w:p>
             <w:pPr>
               <w:pStyle w:val="Compact"/>
-              <w:jc w:val="right"/>
+              <w:jc w:val="left"/>
             </w:pPr>
             <w:r>
               <w:t xml:space="preserve">159.992</w:t>
@@ -11363,7 +11411,7 @@
               <w:jc w:val="left"/>
             </w:pPr>
             <w:r>
-              <w:t xml:space="preserve">nan</w:t>
+              <w:t xml:space="preserve">undefined</w:t>
             </w:r>
           </w:p>
         </w:tc>
@@ -11506,7 +11554,7 @@
           <w:p>
             <w:pPr>
               <w:pStyle w:val="Compact"/>
-              <w:jc w:val="right"/>
+              <w:jc w:val="left"/>
             </w:pPr>
             <w:r>
               <w:t xml:space="preserve">159.992</w:t>
@@ -11521,7 +11569,7 @@
               <w:jc w:val="left"/>
             </w:pPr>
             <w:r>
-              <w:t xml:space="preserve">nan</w:t>
+              <w:t xml:space="preserve">undefined</w:t>
             </w:r>
           </w:p>
         </w:tc>
@@ -11664,7 +11712,7 @@
           <w:p>
             <w:pPr>
               <w:pStyle w:val="Compact"/>
-              <w:jc w:val="right"/>
+              <w:jc w:val="left"/>
             </w:pPr>
             <w:r>
               <w:t xml:space="preserve">159.992</w:t>
@@ -11679,7 +11727,7 @@
               <w:jc w:val="left"/>
             </w:pPr>
             <w:r>
-              <w:t xml:space="preserve">nan</w:t>
+              <w:t xml:space="preserve">undefined</w:t>
             </w:r>
           </w:p>
         </w:tc>
@@ -11822,10 +11870,10 @@
           <w:p>
             <w:pPr>
               <w:pStyle w:val="Compact"/>
-              <w:jc w:val="right"/>
-            </w:pPr>
-            <w:r>
-              <w:t xml:space="preserve">nan</w:t>
+              <w:jc w:val="left"/>
+            </w:pPr>
+            <w:r>
+              <w:t xml:space="preserve">undefined</w:t>
             </w:r>
           </w:p>
         </w:tc>
@@ -11980,10 +12028,10 @@
           <w:p>
             <w:pPr>
               <w:pStyle w:val="Compact"/>
-              <w:jc w:val="right"/>
-            </w:pPr>
-            <w:r>
-              <w:t xml:space="preserve">nan</w:t>
+              <w:jc w:val="left"/>
+            </w:pPr>
+            <w:r>
+              <w:t xml:space="preserve">undefined</w:t>
             </w:r>
           </w:p>
         </w:tc>
@@ -12138,10 +12186,10 @@
           <w:p>
             <w:pPr>
               <w:pStyle w:val="Compact"/>
-              <w:jc w:val="right"/>
-            </w:pPr>
-            <w:r>
-              <w:t xml:space="preserve">nan</w:t>
+              <w:jc w:val="left"/>
+            </w:pPr>
+            <w:r>
+              <w:t xml:space="preserve">undefined</w:t>
             </w:r>
           </w:p>
         </w:tc>
@@ -12215,38 +12263,38 @@
       <w:tblGrid>
         <w:gridCol w:w="145"/>
         <w:gridCol w:w="176"/>
-        <w:gridCol w:w="208"/>
-        <w:gridCol w:w="156"/>
+        <w:gridCol w:w="207"/>
+        <w:gridCol w:w="155"/>
         <w:gridCol w:w="176"/>
         <w:gridCol w:w="114"/>
         <w:gridCol w:w="176"/>
         <w:gridCol w:w="218"/>
         <w:gridCol w:w="135"/>
         <w:gridCol w:w="166"/>
-        <w:gridCol w:w="208"/>
+        <w:gridCol w:w="207"/>
         <w:gridCol w:w="249"/>
         <w:gridCol w:w="218"/>
         <w:gridCol w:w="145"/>
-        <w:gridCol w:w="104"/>
+        <w:gridCol w:w="103"/>
         <w:gridCol w:w="218"/>
         <w:gridCol w:w="218"/>
         <w:gridCol w:w="228"/>
         <w:gridCol w:w="166"/>
-        <w:gridCol w:w="104"/>
+        <w:gridCol w:w="103"/>
         <w:gridCol w:w="197"/>
         <w:gridCol w:w="197"/>
         <w:gridCol w:w="166"/>
-        <w:gridCol w:w="603"/>
+        <w:gridCol w:w="602"/>
         <w:gridCol w:w="353"/>
-        <w:gridCol w:w="343"/>
+        <w:gridCol w:w="342"/>
         <w:gridCol w:w="197"/>
-        <w:gridCol w:w="312"/>
-        <w:gridCol w:w="697"/>
-        <w:gridCol w:w="718"/>
+        <w:gridCol w:w="311"/>
+        <w:gridCol w:w="696"/>
+        <w:gridCol w:w="717"/>
         <w:gridCol w:w="176"/>
         <w:gridCol w:w="187"/>
         <w:gridCol w:w="124"/>
-        <w:gridCol w:w="104"/>
+        <w:gridCol w:w="114"/>
       </w:tblGrid>
       <w:tr>
         <w:trPr>
@@ -12305,7 +12353,7 @@
           <w:p>
             <w:pPr>
               <w:pStyle w:val="Compact"/>
-              <w:jc w:val="right"/>
+              <w:jc w:val="left"/>
             </w:pPr>
             <w:r>
               <w:t xml:space="preserve">overlap_ratio</w:t>
@@ -12653,7 +12701,7 @@
           <w:p>
             <w:pPr>
               <w:pStyle w:val="Compact"/>
-              <w:jc w:val="right"/>
+              <w:jc w:val="left"/>
             </w:pPr>
             <w:r>
               <w:t xml:space="preserve">reason</w:t>
@@ -12715,10 +12763,10 @@
           <w:p>
             <w:pPr>
               <w:pStyle w:val="Compact"/>
-              <w:jc w:val="right"/>
-            </w:pPr>
-            <w:r>
-              <w:t xml:space="preserve">nan</w:t>
+              <w:jc w:val="left"/>
+            </w:pPr>
+            <w:r>
+              <w:t xml:space="preserve">undefined</w:t>
             </w:r>
           </w:p>
         </w:tc>
@@ -13105,10 +13153,10 @@
           <w:p>
             <w:pPr>
               <w:pStyle w:val="Compact"/>
-              <w:jc w:val="right"/>
-            </w:pPr>
-            <w:r>
-              <w:t xml:space="preserve">nan</w:t>
+              <w:jc w:val="left"/>
+            </w:pPr>
+            <w:r>
+              <w:t xml:space="preserve">undefined</w:t>
             </w:r>
           </w:p>
         </w:tc>
@@ -13167,10 +13215,10 @@
           <w:p>
             <w:pPr>
               <w:pStyle w:val="Compact"/>
-              <w:jc w:val="right"/>
-            </w:pPr>
-            <w:r>
-              <w:t xml:space="preserve">nan</w:t>
+              <w:jc w:val="left"/>
+            </w:pPr>
+            <w:r>
+              <w:t xml:space="preserve">undefined</w:t>
             </w:r>
           </w:p>
         </w:tc>
@@ -13551,10 +13599,10 @@
           <w:p>
             <w:pPr>
               <w:pStyle w:val="Compact"/>
-              <w:jc w:val="right"/>
-            </w:pPr>
-            <w:r>
-              <w:t xml:space="preserve">nan</w:t>
+              <w:jc w:val="left"/>
+            </w:pPr>
+            <w:r>
+              <w:t xml:space="preserve">undefined</w:t>
             </w:r>
           </w:p>
         </w:tc>
@@ -13613,10 +13661,10 @@
           <w:p>
             <w:pPr>
               <w:pStyle w:val="Compact"/>
-              <w:jc w:val="right"/>
-            </w:pPr>
-            <w:r>
-              <w:t xml:space="preserve">nan</w:t>
+              <w:jc w:val="left"/>
+            </w:pPr>
+            <w:r>
+              <w:t xml:space="preserve">undefined</w:t>
             </w:r>
           </w:p>
         </w:tc>
@@ -14015,10 +14063,10 @@
           <w:p>
             <w:pPr>
               <w:pStyle w:val="Compact"/>
-              <w:jc w:val="right"/>
-            </w:pPr>
-            <w:r>
-              <w:t xml:space="preserve">nan</w:t>
+              <w:jc w:val="left"/>
+            </w:pPr>
+            <w:r>
+              <w:t xml:space="preserve">undefined</w:t>
             </w:r>
           </w:p>
         </w:tc>
@@ -14077,10 +14125,10 @@
           <w:p>
             <w:pPr>
               <w:pStyle w:val="Compact"/>
-              <w:jc w:val="right"/>
-            </w:pPr>
-            <w:r>
-              <w:t xml:space="preserve">nan</w:t>
+              <w:jc w:val="left"/>
+            </w:pPr>
+            <w:r>
+              <w:t xml:space="preserve">undefined</w:t>
             </w:r>
           </w:p>
         </w:tc>
@@ -14461,10 +14509,10 @@
           <w:p>
             <w:pPr>
               <w:pStyle w:val="Compact"/>
-              <w:jc w:val="right"/>
-            </w:pPr>
-            <w:r>
-              <w:t xml:space="preserve">nan</w:t>
+              <w:jc w:val="left"/>
+            </w:pPr>
+            <w:r>
+              <w:t xml:space="preserve">undefined</w:t>
             </w:r>
           </w:p>
         </w:tc>
@@ -14523,10 +14571,10 @@
           <w:p>
             <w:pPr>
               <w:pStyle w:val="Compact"/>
-              <w:jc w:val="right"/>
-            </w:pPr>
-            <w:r>
-              <w:t xml:space="preserve">nan</w:t>
+              <w:jc w:val="left"/>
+            </w:pPr>
+            <w:r>
+              <w:t xml:space="preserve">undefined</w:t>
             </w:r>
           </w:p>
         </w:tc>
@@ -14907,10 +14955,10 @@
           <w:p>
             <w:pPr>
               <w:pStyle w:val="Compact"/>
-              <w:jc w:val="right"/>
-            </w:pPr>
-            <w:r>
-              <w:t xml:space="preserve">nan</w:t>
+              <w:jc w:val="left"/>
+            </w:pPr>
+            <w:r>
+              <w:t xml:space="preserve">undefined</w:t>
             </w:r>
           </w:p>
         </w:tc>
@@ -14969,10 +15017,10 @@
           <w:p>
             <w:pPr>
               <w:pStyle w:val="Compact"/>
-              <w:jc w:val="right"/>
-            </w:pPr>
-            <w:r>
-              <w:t xml:space="preserve">nan</w:t>
+              <w:jc w:val="left"/>
+            </w:pPr>
+            <w:r>
+              <w:t xml:space="preserve">undefined</w:t>
             </w:r>
           </w:p>
         </w:tc>
@@ -15353,10 +15401,10 @@
           <w:p>
             <w:pPr>
               <w:pStyle w:val="Compact"/>
-              <w:jc w:val="right"/>
-            </w:pPr>
-            <w:r>
-              <w:t xml:space="preserve">nan</w:t>
+              <w:jc w:val="left"/>
+            </w:pPr>
+            <w:r>
+              <w:t xml:space="preserve">undefined</w:t>
             </w:r>
           </w:p>
         </w:tc>
@@ -15415,10 +15463,10 @@
           <w:p>
             <w:pPr>
               <w:pStyle w:val="Compact"/>
-              <w:jc w:val="right"/>
-            </w:pPr>
-            <w:r>
-              <w:t xml:space="preserve">nan</w:t>
+              <w:jc w:val="left"/>
+            </w:pPr>
+            <w:r>
+              <w:t xml:space="preserve">undefined</w:t>
             </w:r>
           </w:p>
         </w:tc>
@@ -15811,10 +15859,10 @@
           <w:p>
             <w:pPr>
               <w:pStyle w:val="Compact"/>
-              <w:jc w:val="right"/>
-            </w:pPr>
-            <w:r>
-              <w:t xml:space="preserve">nan</w:t>
+              <w:jc w:val="left"/>
+            </w:pPr>
+            <w:r>
+              <w:t xml:space="preserve">undefined</w:t>
             </w:r>
           </w:p>
         </w:tc>
@@ -15873,10 +15921,10 @@
           <w:p>
             <w:pPr>
               <w:pStyle w:val="Compact"/>
-              <w:jc w:val="right"/>
-            </w:pPr>
-            <w:r>
-              <w:t xml:space="preserve">nan</w:t>
+              <w:jc w:val="left"/>
+            </w:pPr>
+            <w:r>
+              <w:t xml:space="preserve">undefined</w:t>
             </w:r>
           </w:p>
         </w:tc>
@@ -16269,10 +16317,10 @@
           <w:p>
             <w:pPr>
               <w:pStyle w:val="Compact"/>
-              <w:jc w:val="right"/>
-            </w:pPr>
-            <w:r>
-              <w:t xml:space="preserve">nan</w:t>
+              <w:jc w:val="left"/>
+            </w:pPr>
+            <w:r>
+              <w:t xml:space="preserve">undefined</w:t>
             </w:r>
           </w:p>
         </w:tc>
@@ -16331,10 +16379,10 @@
           <w:p>
             <w:pPr>
               <w:pStyle w:val="Compact"/>
-              <w:jc w:val="right"/>
-            </w:pPr>
-            <w:r>
-              <w:t xml:space="preserve">nan</w:t>
+              <w:jc w:val="left"/>
+            </w:pPr>
+            <w:r>
+              <w:t xml:space="preserve">undefined</w:t>
             </w:r>
           </w:p>
         </w:tc>
@@ -16727,10 +16775,10 @@
           <w:p>
             <w:pPr>
               <w:pStyle w:val="Compact"/>
-              <w:jc w:val="right"/>
-            </w:pPr>
-            <w:r>
-              <w:t xml:space="preserve">nan</w:t>
+              <w:jc w:val="left"/>
+            </w:pPr>
+            <w:r>
+              <w:t xml:space="preserve">undefined</w:t>
             </w:r>
           </w:p>
         </w:tc>

</xml_diff>